<commit_message>
Update samples: split sample workbook into Database and Handbook
Replace УСТАНОВЧІ ДАНІ ОС.xlsx with separate Database.xlsx and
Handbook.xlsx, refresh the F-1 template with the new rank computed
values, and update the sample-files table in spreadsheet-setup.md.

Co-Authored-By: Claude Sonnet 5.5 <noreply@anthropic.com>
Claude-Session: https://claude.ai/code/session_018UA45AD4WG51Q7YMWGuJuW
</commit_message>
<xml_diff>
--- a/samples/ДОВІДКА (Ф-1).docx
+++ b/samples/ДОВІДКА (Ф-1).docx
@@ -306,7 +306,7 @@
                 <w:szCs w:val="28"/>
                 <w:rtl w:val="0"/>
               </w:rPr>
-              <w:t xml:space="preserve">{Дата призову}</w:t>
+              <w:t xml:space="preserve">{Дата присвоєння військового звання}</w:t>
             </w:r>
             <w:r>
               <w:rPr>
@@ -528,7 +528,7 @@
                 <w:szCs w:val="28"/>
                 <w:rtl w:val="0"/>
               </w:rPr>
-              <w:t xml:space="preserve">{Військове звання}</w:t>
+              <w:t xml:space="preserve">{Звання по штату}</w:t>
             </w:r>
             <w:r>
               <w:rPr>

</xml_diff>

<commit_message>
Update samples for militaryUnit: Handbook A4 and F-1 template
Co-Authored-By: Claude Sonnet 5.5 <noreply@anthropic.com>
Claude-Session: https://claude.ai/code/session_01J12acAFgWgqroeNTsZ9hjS
</commit_message>
<xml_diff>
--- a/samples/ДОВІДКА (Ф-1).docx
+++ b/samples/ДОВІДКА (Ф-1).docx
@@ -491,7 +491,35 @@
                 <w:vertAlign w:val="baseline"/>
                 <w:rtl w:val="0"/>
               </w:rPr>
-              <w:t xml:space="preserve"> військової частини 3102, з </w:t>
+              <w:t xml:space="preserve"> військової частини </w:t>
+            </w:r>
+            <w:r>
+              <w:rPr>
+                <w:rFonts w:ascii="Times New Roman" w:cs="Times New Roman" w:eastAsia="Times New Roman" w:hAnsi="Times New Roman"/>
+                <w:sz w:val="28"/>
+                <w:szCs w:val="28"/>
+                <w:rtl w:val="0"/>
+              </w:rPr>
+              <w:t xml:space="preserve">{Військова частина}</w:t>
+            </w:r>
+            <w:r>
+              <w:rPr>
+                <w:rFonts w:ascii="Times New Roman" w:cs="Times New Roman" w:eastAsia="Times New Roman" w:hAnsi="Times New Roman"/>
+                <w:b w:val="0"/>
+                <w:bCs w:val="0"/>
+                <w:i w:val="0"/>
+                <w:iCs w:val="0"/>
+                <w:smallCaps w:val="0"/>
+                <w:strike w:val="0"/>
+                <w:color w:val="000000"/>
+                <w:sz w:val="28"/>
+                <w:szCs w:val="28"/>
+                <w:u w:val="none"/>
+                <w:shd w:fill="auto" w:val="clear"/>
+                <w:vertAlign w:val="baseline"/>
+                <w:rtl w:val="0"/>
+              </w:rPr>
+              <w:t xml:space="preserve">, з </w:t>
             </w:r>
             <w:r>
               <w:rPr>

</xml_diff>